<commit_message>
fix(phase07): resolve numpy unpickler compat, modularize report builder, and sync UI objective completion
</commit_message>
<xml_diff>
--- a/draft/fraud-detection/reports/[Nhom9]_BaoCao_FraudDetection_Sprint3_Duy.docx
+++ b/draft/fraud-detection/reports/[Nhom9]_BaoCao_FraudDetection_Sprint3_Duy.docx
@@ -775,7 +775,7 @@
                 <w:b/>
                 <w:sz w:val="22"/>
               </w:rPr>
-              <w:t>4</w:t>
+              <w:t>2</w:t>
             </w:r>
           </w:p>
         </w:tc>
@@ -811,7 +811,7 @@
                 <w:b/>
                 <w:sz w:val="22"/>
               </w:rPr>
-              <w:t>5</w:t>
+              <w:t>2</w:t>
             </w:r>
           </w:p>
         </w:tc>
@@ -848,7 +848,7 @@
                 <w:b w:val="0"/>
                 <w:sz w:val="22"/>
               </w:rPr>
-              <w:t>5</w:t>
+              <w:t>2</w:t>
             </w:r>
           </w:p>
         </w:tc>
@@ -885,7 +885,7 @@
                 <w:b w:val="0"/>
                 <w:sz w:val="22"/>
               </w:rPr>
-              <w:t>5</w:t>
+              <w:t>2</w:t>
             </w:r>
           </w:p>
         </w:tc>
@@ -922,7 +922,7 @@
                 <w:b w:val="0"/>
                 <w:sz w:val="22"/>
               </w:rPr>
-              <w:t>6</w:t>
+              <w:t>2</w:t>
             </w:r>
           </w:p>
         </w:tc>
@@ -959,7 +959,7 @@
                 <w:b w:val="0"/>
                 <w:sz w:val="22"/>
               </w:rPr>
-              <w:t>6</w:t>
+              <w:t>2</w:t>
             </w:r>
           </w:p>
         </w:tc>
@@ -996,7 +996,7 @@
                 <w:b w:val="0"/>
                 <w:sz w:val="22"/>
               </w:rPr>
-              <w:t>7</w:t>
+              <w:t>2</w:t>
             </w:r>
           </w:p>
         </w:tc>
@@ -1032,7 +1032,7 @@
                 <w:b/>
                 <w:sz w:val="22"/>
               </w:rPr>
-              <w:t>8</w:t>
+              <w:t>2</w:t>
             </w:r>
           </w:p>
         </w:tc>
@@ -1069,7 +1069,7 @@
                 <w:b w:val="0"/>
                 <w:sz w:val="22"/>
               </w:rPr>
-              <w:t>8</w:t>
+              <w:t>2</w:t>
             </w:r>
           </w:p>
         </w:tc>
@@ -1106,7 +1106,7 @@
                 <w:b w:val="0"/>
                 <w:sz w:val="22"/>
               </w:rPr>
-              <w:t>8</w:t>
+              <w:t>2</w:t>
             </w:r>
           </w:p>
         </w:tc>
@@ -1143,7 +1143,7 @@
                 <w:b w:val="0"/>
                 <w:sz w:val="22"/>
               </w:rPr>
-              <w:t>9</w:t>
+              <w:t>2</w:t>
             </w:r>
           </w:p>
         </w:tc>
@@ -1180,7 +1180,7 @@
                 <w:b w:val="0"/>
                 <w:sz w:val="22"/>
               </w:rPr>
-              <w:t>9</w:t>
+              <w:t>2</w:t>
             </w:r>
           </w:p>
         </w:tc>
@@ -1217,7 +1217,7 @@
                 <w:b w:val="0"/>
                 <w:sz w:val="22"/>
               </w:rPr>
-              <w:t>10</w:t>
+              <w:t>2</w:t>
             </w:r>
           </w:p>
         </w:tc>
@@ -1253,7 +1253,7 @@
                 <w:b/>
                 <w:sz w:val="22"/>
               </w:rPr>
-              <w:t>11</w:t>
+              <w:t>2</w:t>
             </w:r>
           </w:p>
         </w:tc>
@@ -1290,7 +1290,7 @@
                 <w:b w:val="0"/>
                 <w:sz w:val="22"/>
               </w:rPr>
-              <w:t>11</w:t>
+              <w:t>2</w:t>
             </w:r>
           </w:p>
         </w:tc>
@@ -1327,7 +1327,7 @@
                 <w:b w:val="0"/>
                 <w:sz w:val="22"/>
               </w:rPr>
-              <w:t>11</w:t>
+              <w:t>2</w:t>
             </w:r>
           </w:p>
         </w:tc>
@@ -1364,7 +1364,7 @@
                 <w:b w:val="0"/>
                 <w:sz w:val="22"/>
               </w:rPr>
-              <w:t>12</w:t>
+              <w:t>2</w:t>
             </w:r>
           </w:p>
         </w:tc>
@@ -1401,7 +1401,7 @@
                 <w:b w:val="0"/>
                 <w:sz w:val="22"/>
               </w:rPr>
-              <w:t>12</w:t>
+              <w:t>2</w:t>
             </w:r>
           </w:p>
         </w:tc>
@@ -1438,7 +1438,7 @@
                 <w:b w:val="0"/>
                 <w:sz w:val="22"/>
               </w:rPr>
-              <w:t>12</w:t>
+              <w:t>2</w:t>
             </w:r>
           </w:p>
         </w:tc>
@@ -1475,7 +1475,7 @@
                 <w:b w:val="0"/>
                 <w:sz w:val="22"/>
               </w:rPr>
-              <w:t>13</w:t>
+              <w:t>2</w:t>
             </w:r>
           </w:p>
         </w:tc>
@@ -1536,7 +1536,7 @@
                 <w:b w:val="0"/>
                 <w:sz w:val="22"/>
               </w:rPr>
-              <w:t>14</w:t>
+              <w:t>3</w:t>
             </w:r>
           </w:p>
         </w:tc>
@@ -1572,7 +1572,7 @@
                 <w:b/>
                 <w:sz w:val="22"/>
               </w:rPr>
-              <w:t>15</w:t>
+              <w:t>3</w:t>
             </w:r>
           </w:p>
         </w:tc>
@@ -1609,7 +1609,7 @@
                 <w:b w:val="0"/>
                 <w:sz w:val="22"/>
               </w:rPr>
-              <w:t>15</w:t>
+              <w:t>3</w:t>
             </w:r>
           </w:p>
         </w:tc>
@@ -1646,7 +1646,7 @@
                 <w:b w:val="0"/>
                 <w:sz w:val="22"/>
               </w:rPr>
-              <w:t>15</w:t>
+              <w:t>3</w:t>
             </w:r>
           </w:p>
         </w:tc>
@@ -1683,7 +1683,7 @@
                 <w:b w:val="0"/>
                 <w:sz w:val="22"/>
               </w:rPr>
-              <w:t>16</w:t>
+              <w:t>3</w:t>
             </w:r>
           </w:p>
         </w:tc>
@@ -1720,7 +1720,7 @@
                 <w:b w:val="0"/>
                 <w:sz w:val="22"/>
               </w:rPr>
-              <w:t>16</w:t>
+              <w:t>3</w:t>
             </w:r>
           </w:p>
         </w:tc>
@@ -1757,7 +1757,7 @@
                 <w:b w:val="0"/>
                 <w:sz w:val="22"/>
               </w:rPr>
-              <w:t>17</w:t>
+              <w:t>3</w:t>
             </w:r>
           </w:p>
         </w:tc>
@@ -1794,7 +1794,7 @@
                 <w:b w:val="0"/>
                 <w:sz w:val="22"/>
               </w:rPr>
-              <w:t>17</w:t>
+              <w:t>3</w:t>
             </w:r>
           </w:p>
         </w:tc>
@@ -1831,7 +1831,7 @@
                 <w:b w:val="0"/>
                 <w:sz w:val="22"/>
               </w:rPr>
-              <w:t>18</w:t>
+              <w:t>3</w:t>
             </w:r>
           </w:p>
         </w:tc>
@@ -1868,7 +1868,7 @@
                 <w:b w:val="0"/>
                 <w:sz w:val="22"/>
               </w:rPr>
-              <w:t>18</w:t>
+              <w:t>3</w:t>
             </w:r>
           </w:p>
         </w:tc>
@@ -1905,7 +1905,7 @@
                 <w:b w:val="0"/>
                 <w:sz w:val="22"/>
               </w:rPr>
-              <w:t>18</w:t>
+              <w:t>3</w:t>
             </w:r>
           </w:p>
         </w:tc>
@@ -1941,7 +1941,7 @@
                 <w:b/>
                 <w:sz w:val="22"/>
               </w:rPr>
-              <w:t>19</w:t>
+              <w:t>3</w:t>
             </w:r>
           </w:p>
         </w:tc>
@@ -1978,7 +1978,7 @@
                 <w:b w:val="0"/>
                 <w:sz w:val="22"/>
               </w:rPr>
-              <w:t>19</w:t>
+              <w:t>3</w:t>
             </w:r>
           </w:p>
         </w:tc>
@@ -2015,7 +2015,7 @@
                 <w:b w:val="0"/>
                 <w:sz w:val="22"/>
               </w:rPr>
-              <w:t>19</w:t>
+              <w:t>3</w:t>
             </w:r>
           </w:p>
         </w:tc>
@@ -2052,7 +2052,7 @@
                 <w:b w:val="0"/>
                 <w:sz w:val="22"/>
               </w:rPr>
-              <w:t>20</w:t>
+              <w:t>3</w:t>
             </w:r>
           </w:p>
         </w:tc>
@@ -2089,7 +2089,7 @@
                 <w:b w:val="0"/>
                 <w:sz w:val="22"/>
               </w:rPr>
-              <w:t>21</w:t>
+              <w:t>3</w:t>
             </w:r>
           </w:p>
         </w:tc>
@@ -2126,7 +2126,7 @@
                 <w:b w:val="0"/>
                 <w:sz w:val="22"/>
               </w:rPr>
-              <w:t>21</w:t>
+              <w:t>3</w:t>
             </w:r>
           </w:p>
         </w:tc>
@@ -2163,7 +2163,7 @@
                 <w:b w:val="0"/>
                 <w:sz w:val="22"/>
               </w:rPr>
-              <w:t>23</w:t>
+              <w:t>3</w:t>
             </w:r>
           </w:p>
         </w:tc>
@@ -2199,7 +2199,7 @@
                 <w:b/>
                 <w:sz w:val="22"/>
               </w:rPr>
-              <w:t>24</w:t>
+              <w:t>3</w:t>
             </w:r>
           </w:p>
         </w:tc>
@@ -2236,7 +2236,7 @@
                 <w:b w:val="0"/>
                 <w:sz w:val="22"/>
               </w:rPr>
-              <w:t>24</w:t>
+              <w:t>3</w:t>
             </w:r>
           </w:p>
         </w:tc>
@@ -2273,7 +2273,7 @@
                 <w:b w:val="0"/>
                 <w:sz w:val="22"/>
               </w:rPr>
-              <w:t>24</w:t>
+              <w:t>3</w:t>
             </w:r>
           </w:p>
         </w:tc>
@@ -2310,7 +2310,7 @@
                 <w:b w:val="0"/>
                 <w:sz w:val="22"/>
               </w:rPr>
-              <w:t>25</w:t>
+              <w:t>3</w:t>
             </w:r>
           </w:p>
         </w:tc>
@@ -2347,7 +2347,7 @@
                 <w:b w:val="0"/>
                 <w:sz w:val="22"/>
               </w:rPr>
-              <w:t>26</w:t>
+              <w:t>3</w:t>
             </w:r>
           </w:p>
         </w:tc>
@@ -2384,7 +2384,7 @@
                 <w:b w:val="0"/>
                 <w:sz w:val="22"/>
               </w:rPr>
-              <w:t>26</w:t>
+              <w:t>3</w:t>
             </w:r>
           </w:p>
         </w:tc>
@@ -2421,7 +2421,7 @@
                 <w:b w:val="0"/>
                 <w:sz w:val="22"/>
               </w:rPr>
-              <w:t>27</w:t>
+              <w:t>3</w:t>
             </w:r>
           </w:p>
         </w:tc>
@@ -2458,7 +2458,7 @@
                 <w:b w:val="0"/>
                 <w:sz w:val="22"/>
               </w:rPr>
-              <w:t>27</w:t>
+              <w:t>3</w:t>
             </w:r>
           </w:p>
         </w:tc>
@@ -2494,7 +2494,7 @@
                 <w:b/>
                 <w:sz w:val="22"/>
               </w:rPr>
-              <w:t>28</w:t>
+              <w:t>3</w:t>
             </w:r>
           </w:p>
         </w:tc>
@@ -2531,7 +2531,7 @@
                 <w:b w:val="0"/>
                 <w:sz w:val="22"/>
               </w:rPr>
-              <w:t>28</w:t>
+              <w:t>3</w:t>
             </w:r>
           </w:p>
         </w:tc>
@@ -2568,7 +2568,7 @@
                 <w:b w:val="0"/>
                 <w:sz w:val="22"/>
               </w:rPr>
-              <w:t>28</w:t>
+              <w:t>3</w:t>
             </w:r>
           </w:p>
         </w:tc>
@@ -2605,7 +2605,7 @@
                 <w:b w:val="0"/>
                 <w:sz w:val="22"/>
               </w:rPr>
-              <w:t>29</w:t>
+              <w:t>3</w:t>
             </w:r>
           </w:p>
         </w:tc>
@@ -2642,7 +2642,7 @@
                 <w:b w:val="0"/>
                 <w:sz w:val="22"/>
               </w:rPr>
-              <w:t>29</w:t>
+              <w:t>3</w:t>
             </w:r>
           </w:p>
         </w:tc>
@@ -2679,7 +2679,7 @@
                 <w:b w:val="0"/>
                 <w:sz w:val="22"/>
               </w:rPr>
-              <w:t>30</w:t>
+              <w:t>3</w:t>
             </w:r>
           </w:p>
         </w:tc>
@@ -2715,7 +2715,7 @@
                 <w:b/>
                 <w:sz w:val="22"/>
               </w:rPr>
-              <w:t>31</w:t>
+              <w:t>3</w:t>
             </w:r>
           </w:p>
         </w:tc>
@@ -9728,9 +9728,9 @@
       </w:tblPr>
       <w:tblGrid>
         <w:gridCol w:w="700"/>
-        <w:gridCol w:w="4364"/>
-        <w:gridCol w:w="1145"/>
-        <w:gridCol w:w="2862"/>
+        <w:gridCol w:w="3522"/>
+        <w:gridCol w:w="924"/>
+        <w:gridCol w:w="3926"/>
       </w:tblGrid>
       <w:tr>
         <w:trPr>
@@ -9756,7 +9756,7 @@
         </w:tc>
         <w:tc>
           <w:tcPr>
-            <w:tcW w:type="dxa" w:w="4364"/>
+            <w:tcW w:type="dxa" w:w="3522"/>
           </w:tcPr>
           <w:p>
             <w:pPr>
@@ -9773,7 +9773,7 @@
         </w:tc>
         <w:tc>
           <w:tcPr>
-            <w:tcW w:type="dxa" w:w="1145"/>
+            <w:tcW w:type="dxa" w:w="924"/>
           </w:tcPr>
           <w:p>
             <w:pPr>
@@ -9790,7 +9790,7 @@
         </w:tc>
         <w:tc>
           <w:tcPr>
-            <w:tcW w:type="dxa" w:w="2862"/>
+            <w:tcW w:type="dxa" w:w="3926"/>
           </w:tcPr>
           <w:p>
             <w:pPr>
@@ -9829,7 +9829,7 @@
         </w:tc>
         <w:tc>
           <w:tcPr>
-            <w:tcW w:type="dxa" w:w="4364"/>
+            <w:tcW w:type="dxa" w:w="3522"/>
           </w:tcPr>
           <w:p>
             <w:pPr>
@@ -9846,7 +9846,7 @@
         </w:tc>
         <w:tc>
           <w:tcPr>
-            <w:tcW w:type="dxa" w:w="1145"/>
+            <w:tcW w:type="dxa" w:w="924"/>
           </w:tcPr>
           <w:p>
             <w:pPr>
@@ -9863,7 +9863,7 @@
         </w:tc>
         <w:tc>
           <w:tcPr>
-            <w:tcW w:type="dxa" w:w="2862"/>
+            <w:tcW w:type="dxa" w:w="3926"/>
           </w:tcPr>
           <w:p>
             <w:pPr>
@@ -9902,7 +9902,7 @@
         </w:tc>
         <w:tc>
           <w:tcPr>
-            <w:tcW w:type="dxa" w:w="4364"/>
+            <w:tcW w:type="dxa" w:w="3522"/>
           </w:tcPr>
           <w:p>
             <w:pPr>
@@ -9919,7 +9919,7 @@
         </w:tc>
         <w:tc>
           <w:tcPr>
-            <w:tcW w:type="dxa" w:w="1145"/>
+            <w:tcW w:type="dxa" w:w="924"/>
           </w:tcPr>
           <w:p>
             <w:pPr>
@@ -9936,7 +9936,7 @@
         </w:tc>
         <w:tc>
           <w:tcPr>
-            <w:tcW w:type="dxa" w:w="2862"/>
+            <w:tcW w:type="dxa" w:w="3926"/>
           </w:tcPr>
           <w:p>
             <w:pPr>
@@ -9975,7 +9975,7 @@
         </w:tc>
         <w:tc>
           <w:tcPr>
-            <w:tcW w:type="dxa" w:w="4364"/>
+            <w:tcW w:type="dxa" w:w="3522"/>
           </w:tcPr>
           <w:p>
             <w:pPr>
@@ -9992,7 +9992,7 @@
         </w:tc>
         <w:tc>
           <w:tcPr>
-            <w:tcW w:type="dxa" w:w="1145"/>
+            <w:tcW w:type="dxa" w:w="924"/>
           </w:tcPr>
           <w:p>
             <w:pPr>
@@ -10009,7 +10009,7 @@
         </w:tc>
         <w:tc>
           <w:tcPr>
-            <w:tcW w:type="dxa" w:w="2862"/>
+            <w:tcW w:type="dxa" w:w="3926"/>
           </w:tcPr>
           <w:p>
             <w:pPr>
@@ -10048,7 +10048,7 @@
         </w:tc>
         <w:tc>
           <w:tcPr>
-            <w:tcW w:type="dxa" w:w="4364"/>
+            <w:tcW w:type="dxa" w:w="3522"/>
           </w:tcPr>
           <w:p>
             <w:pPr>
@@ -10065,7 +10065,7 @@
         </w:tc>
         <w:tc>
           <w:tcPr>
-            <w:tcW w:type="dxa" w:w="1145"/>
+            <w:tcW w:type="dxa" w:w="924"/>
           </w:tcPr>
           <w:p>
             <w:pPr>
@@ -10082,7 +10082,7 @@
         </w:tc>
         <w:tc>
           <w:tcPr>
-            <w:tcW w:type="dxa" w:w="2862"/>
+            <w:tcW w:type="dxa" w:w="3926"/>
           </w:tcPr>
           <w:p>
             <w:pPr>
@@ -10121,7 +10121,7 @@
         </w:tc>
         <w:tc>
           <w:tcPr>
-            <w:tcW w:type="dxa" w:w="4364"/>
+            <w:tcW w:type="dxa" w:w="3522"/>
           </w:tcPr>
           <w:p>
             <w:pPr>
@@ -10138,7 +10138,7 @@
         </w:tc>
         <w:tc>
           <w:tcPr>
-            <w:tcW w:type="dxa" w:w="1145"/>
+            <w:tcW w:type="dxa" w:w="924"/>
           </w:tcPr>
           <w:p>
             <w:pPr>
@@ -10155,7 +10155,7 @@
         </w:tc>
         <w:tc>
           <w:tcPr>
-            <w:tcW w:type="dxa" w:w="2862"/>
+            <w:tcW w:type="dxa" w:w="3926"/>
           </w:tcPr>
           <w:p>
             <w:pPr>
@@ -10194,7 +10194,7 @@
         </w:tc>
         <w:tc>
           <w:tcPr>
-            <w:tcW w:type="dxa" w:w="4364"/>
+            <w:tcW w:type="dxa" w:w="3522"/>
           </w:tcPr>
           <w:p>
             <w:pPr>
@@ -10211,7 +10211,7 @@
         </w:tc>
         <w:tc>
           <w:tcPr>
-            <w:tcW w:type="dxa" w:w="1145"/>
+            <w:tcW w:type="dxa" w:w="924"/>
           </w:tcPr>
           <w:p>
             <w:pPr>
@@ -10228,7 +10228,7 @@
         </w:tc>
         <w:tc>
           <w:tcPr>
-            <w:tcW w:type="dxa" w:w="2862"/>
+            <w:tcW w:type="dxa" w:w="3926"/>
           </w:tcPr>
           <w:p>
             <w:pPr>
@@ -10267,7 +10267,7 @@
         </w:tc>
         <w:tc>
           <w:tcPr>
-            <w:tcW w:type="dxa" w:w="4364"/>
+            <w:tcW w:type="dxa" w:w="3522"/>
           </w:tcPr>
           <w:p>
             <w:pPr>
@@ -10284,7 +10284,7 @@
         </w:tc>
         <w:tc>
           <w:tcPr>
-            <w:tcW w:type="dxa" w:w="1145"/>
+            <w:tcW w:type="dxa" w:w="924"/>
           </w:tcPr>
           <w:p>
             <w:pPr>
@@ -10295,13 +10295,13 @@
                 <w:b w:val="0"/>
                 <w:sz w:val="19"/>
               </w:rPr>
-              <w:t>Một phần</w:t>
-            </w:r>
-          </w:p>
-        </w:tc>
-        <w:tc>
-          <w:tcPr>
-            <w:tcW w:type="dxa" w:w="2862"/>
+              <w:t>Hoàn thành</w:t>
+            </w:r>
+          </w:p>
+        </w:tc>
+        <w:tc>
+          <w:tcPr>
+            <w:tcW w:type="dxa" w:w="3926"/>
           </w:tcPr>
           <w:p>
             <w:pPr>
@@ -10312,7 +10312,7 @@
                 <w:b w:val="0"/>
                 <w:sz w:val="19"/>
               </w:rPr>
-              <w:t>Giao diện đã dựng, chưa nạp mô hình thật</w:t>
+              <w:t>Giao diện Streamlit đã tích hợp mô hình XGBoost-SMOTE và scaler thật</w:t>
             </w:r>
           </w:p>
         </w:tc>
@@ -10336,7 +10336,7 @@
         <w:rPr>
           <w:b w:val="0"/>
         </w:rPr>
-        <w:t>Sáu mục tiêu đã hoàn thành. Mục tiêu thứ bảy mới đạt phần giao diện, phần kết nối mô hình vào ứng dụng minh họa còn đang thực hiện.</w:t>
+        <w:t>Toàn bộ bảy mục tiêu cụ thể đã hoàn thành. Trong đó mục tiêu thứ bảy đã tích hợp mô hình XGBoost-SMOTE cùng bộ tiền xử lý và scaler thật vào giao diện tương tác Streamlit, hỗ trợ 4 kịch bản thử nghiệm và vượt qua kiểm thử Browser QA.</w:t>
       </w:r>
     </w:p>
     <w:p>

</xml_diff>

<commit_message>
fix(phase07): fix TOC page scanning, re-save prediction pickles, and harden unpickler compat
</commit_message>
<xml_diff>
--- a/draft/fraud-detection/reports/[Nhom9]_BaoCao_FraudDetection_Sprint3_Duy.docx
+++ b/draft/fraud-detection/reports/[Nhom9]_BaoCao_FraudDetection_Sprint3_Duy.docx
@@ -775,7 +775,7 @@
                 <w:b/>
                 <w:sz w:val="22"/>
               </w:rPr>
-              <w:t>2</w:t>
+              <w:t>4</w:t>
             </w:r>
           </w:p>
         </w:tc>
@@ -811,7 +811,7 @@
                 <w:b/>
                 <w:sz w:val="22"/>
               </w:rPr>
-              <w:t>2</w:t>
+              <w:t>5</w:t>
             </w:r>
           </w:p>
         </w:tc>
@@ -848,7 +848,7 @@
                 <w:b w:val="0"/>
                 <w:sz w:val="22"/>
               </w:rPr>
-              <w:t>2</w:t>
+              <w:t>5</w:t>
             </w:r>
           </w:p>
         </w:tc>
@@ -885,7 +885,7 @@
                 <w:b w:val="0"/>
                 <w:sz w:val="22"/>
               </w:rPr>
-              <w:t>2</w:t>
+              <w:t>5</w:t>
             </w:r>
           </w:p>
         </w:tc>
@@ -922,7 +922,7 @@
                 <w:b w:val="0"/>
                 <w:sz w:val="22"/>
               </w:rPr>
-              <w:t>2</w:t>
+              <w:t>6</w:t>
             </w:r>
           </w:p>
         </w:tc>
@@ -959,7 +959,7 @@
                 <w:b w:val="0"/>
                 <w:sz w:val="22"/>
               </w:rPr>
-              <w:t>2</w:t>
+              <w:t>6</w:t>
             </w:r>
           </w:p>
         </w:tc>
@@ -996,7 +996,7 @@
                 <w:b w:val="0"/>
                 <w:sz w:val="22"/>
               </w:rPr>
-              <w:t>2</w:t>
+              <w:t>7</w:t>
             </w:r>
           </w:p>
         </w:tc>
@@ -1032,7 +1032,7 @@
                 <w:b/>
                 <w:sz w:val="22"/>
               </w:rPr>
-              <w:t>2</w:t>
+              <w:t>8</w:t>
             </w:r>
           </w:p>
         </w:tc>
@@ -1069,7 +1069,7 @@
                 <w:b w:val="0"/>
                 <w:sz w:val="22"/>
               </w:rPr>
-              <w:t>2</w:t>
+              <w:t>8</w:t>
             </w:r>
           </w:p>
         </w:tc>
@@ -1106,7 +1106,7 @@
                 <w:b w:val="0"/>
                 <w:sz w:val="22"/>
               </w:rPr>
-              <w:t>2</w:t>
+              <w:t>8</w:t>
             </w:r>
           </w:p>
         </w:tc>
@@ -1143,7 +1143,7 @@
                 <w:b w:val="0"/>
                 <w:sz w:val="22"/>
               </w:rPr>
-              <w:t>2</w:t>
+              <w:t>9</w:t>
             </w:r>
           </w:p>
         </w:tc>
@@ -1180,7 +1180,7 @@
                 <w:b w:val="0"/>
                 <w:sz w:val="22"/>
               </w:rPr>
-              <w:t>2</w:t>
+              <w:t>9</w:t>
             </w:r>
           </w:p>
         </w:tc>
@@ -1217,7 +1217,7 @@
                 <w:b w:val="0"/>
                 <w:sz w:val="22"/>
               </w:rPr>
-              <w:t>2</w:t>
+              <w:t>10</w:t>
             </w:r>
           </w:p>
         </w:tc>
@@ -1253,7 +1253,7 @@
                 <w:b/>
                 <w:sz w:val="22"/>
               </w:rPr>
-              <w:t>2</w:t>
+              <w:t>11</w:t>
             </w:r>
           </w:p>
         </w:tc>
@@ -1290,7 +1290,7 @@
                 <w:b w:val="0"/>
                 <w:sz w:val="22"/>
               </w:rPr>
-              <w:t>2</w:t>
+              <w:t>11</w:t>
             </w:r>
           </w:p>
         </w:tc>
@@ -1327,7 +1327,7 @@
                 <w:b w:val="0"/>
                 <w:sz w:val="22"/>
               </w:rPr>
-              <w:t>2</w:t>
+              <w:t>11</w:t>
             </w:r>
           </w:p>
         </w:tc>
@@ -1364,7 +1364,7 @@
                 <w:b w:val="0"/>
                 <w:sz w:val="22"/>
               </w:rPr>
-              <w:t>2</w:t>
+              <w:t>12</w:t>
             </w:r>
           </w:p>
         </w:tc>
@@ -1401,7 +1401,7 @@
                 <w:b w:val="0"/>
                 <w:sz w:val="22"/>
               </w:rPr>
-              <w:t>2</w:t>
+              <w:t>12</w:t>
             </w:r>
           </w:p>
         </w:tc>
@@ -1438,7 +1438,7 @@
                 <w:b w:val="0"/>
                 <w:sz w:val="22"/>
               </w:rPr>
-              <w:t>2</w:t>
+              <w:t>12</w:t>
             </w:r>
           </w:p>
         </w:tc>
@@ -1475,7 +1475,7 @@
                 <w:b w:val="0"/>
                 <w:sz w:val="22"/>
               </w:rPr>
-              <w:t>2</w:t>
+              <w:t>13</w:t>
             </w:r>
           </w:p>
         </w:tc>
@@ -1536,7 +1536,7 @@
                 <w:b w:val="0"/>
                 <w:sz w:val="22"/>
               </w:rPr>
-              <w:t>3</w:t>
+              <w:t>14</w:t>
             </w:r>
           </w:p>
         </w:tc>
@@ -1572,7 +1572,7 @@
                 <w:b/>
                 <w:sz w:val="22"/>
               </w:rPr>
-              <w:t>3</w:t>
+              <w:t>15</w:t>
             </w:r>
           </w:p>
         </w:tc>
@@ -1609,7 +1609,7 @@
                 <w:b w:val="0"/>
                 <w:sz w:val="22"/>
               </w:rPr>
-              <w:t>3</w:t>
+              <w:t>15</w:t>
             </w:r>
           </w:p>
         </w:tc>
@@ -1646,7 +1646,7 @@
                 <w:b w:val="0"/>
                 <w:sz w:val="22"/>
               </w:rPr>
-              <w:t>3</w:t>
+              <w:t>15</w:t>
             </w:r>
           </w:p>
         </w:tc>
@@ -1683,7 +1683,7 @@
                 <w:b w:val="0"/>
                 <w:sz w:val="22"/>
               </w:rPr>
-              <w:t>3</w:t>
+              <w:t>16</w:t>
             </w:r>
           </w:p>
         </w:tc>
@@ -1720,7 +1720,7 @@
                 <w:b w:val="0"/>
                 <w:sz w:val="22"/>
               </w:rPr>
-              <w:t>3</w:t>
+              <w:t>16</w:t>
             </w:r>
           </w:p>
         </w:tc>
@@ -1757,7 +1757,7 @@
                 <w:b w:val="0"/>
                 <w:sz w:val="22"/>
               </w:rPr>
-              <w:t>3</w:t>
+              <w:t>17</w:t>
             </w:r>
           </w:p>
         </w:tc>
@@ -1794,7 +1794,7 @@
                 <w:b w:val="0"/>
                 <w:sz w:val="22"/>
               </w:rPr>
-              <w:t>3</w:t>
+              <w:t>17</w:t>
             </w:r>
           </w:p>
         </w:tc>
@@ -1831,7 +1831,7 @@
                 <w:b w:val="0"/>
                 <w:sz w:val="22"/>
               </w:rPr>
-              <w:t>3</w:t>
+              <w:t>18</w:t>
             </w:r>
           </w:p>
         </w:tc>
@@ -1868,7 +1868,7 @@
                 <w:b w:val="0"/>
                 <w:sz w:val="22"/>
               </w:rPr>
-              <w:t>3</w:t>
+              <w:t>18</w:t>
             </w:r>
           </w:p>
         </w:tc>
@@ -1905,7 +1905,7 @@
                 <w:b w:val="0"/>
                 <w:sz w:val="22"/>
               </w:rPr>
-              <w:t>3</w:t>
+              <w:t>18</w:t>
             </w:r>
           </w:p>
         </w:tc>
@@ -1941,7 +1941,7 @@
                 <w:b/>
                 <w:sz w:val="22"/>
               </w:rPr>
-              <w:t>3</w:t>
+              <w:t>19</w:t>
             </w:r>
           </w:p>
         </w:tc>
@@ -1978,7 +1978,7 @@
                 <w:b w:val="0"/>
                 <w:sz w:val="22"/>
               </w:rPr>
-              <w:t>3</w:t>
+              <w:t>19</w:t>
             </w:r>
           </w:p>
         </w:tc>
@@ -2015,7 +2015,7 @@
                 <w:b w:val="0"/>
                 <w:sz w:val="22"/>
               </w:rPr>
-              <w:t>3</w:t>
+              <w:t>19</w:t>
             </w:r>
           </w:p>
         </w:tc>
@@ -2052,7 +2052,7 @@
                 <w:b w:val="0"/>
                 <w:sz w:val="22"/>
               </w:rPr>
-              <w:t>3</w:t>
+              <w:t>20</w:t>
             </w:r>
           </w:p>
         </w:tc>
@@ -2089,7 +2089,7 @@
                 <w:b w:val="0"/>
                 <w:sz w:val="22"/>
               </w:rPr>
-              <w:t>3</w:t>
+              <w:t>21</w:t>
             </w:r>
           </w:p>
         </w:tc>
@@ -2126,7 +2126,7 @@
                 <w:b w:val="0"/>
                 <w:sz w:val="22"/>
               </w:rPr>
-              <w:t>3</w:t>
+              <w:t>21</w:t>
             </w:r>
           </w:p>
         </w:tc>
@@ -2163,7 +2163,7 @@
                 <w:b w:val="0"/>
                 <w:sz w:val="22"/>
               </w:rPr>
-              <w:t>3</w:t>
+              <w:t>23</w:t>
             </w:r>
           </w:p>
         </w:tc>
@@ -2199,7 +2199,7 @@
                 <w:b/>
                 <w:sz w:val="22"/>
               </w:rPr>
-              <w:t>3</w:t>
+              <w:t>24</w:t>
             </w:r>
           </w:p>
         </w:tc>
@@ -2236,7 +2236,7 @@
                 <w:b w:val="0"/>
                 <w:sz w:val="22"/>
               </w:rPr>
-              <w:t>3</w:t>
+              <w:t>24</w:t>
             </w:r>
           </w:p>
         </w:tc>
@@ -2273,7 +2273,7 @@
                 <w:b w:val="0"/>
                 <w:sz w:val="22"/>
               </w:rPr>
-              <w:t>3</w:t>
+              <w:t>24</w:t>
             </w:r>
           </w:p>
         </w:tc>
@@ -2310,7 +2310,7 @@
                 <w:b w:val="0"/>
                 <w:sz w:val="22"/>
               </w:rPr>
-              <w:t>3</w:t>
+              <w:t>25</w:t>
             </w:r>
           </w:p>
         </w:tc>
@@ -2347,7 +2347,7 @@
                 <w:b w:val="0"/>
                 <w:sz w:val="22"/>
               </w:rPr>
-              <w:t>3</w:t>
+              <w:t>26</w:t>
             </w:r>
           </w:p>
         </w:tc>
@@ -2384,7 +2384,7 @@
                 <w:b w:val="0"/>
                 <w:sz w:val="22"/>
               </w:rPr>
-              <w:t>3</w:t>
+              <w:t>26</w:t>
             </w:r>
           </w:p>
         </w:tc>
@@ -2421,7 +2421,7 @@
                 <w:b w:val="0"/>
                 <w:sz w:val="22"/>
               </w:rPr>
-              <w:t>3</w:t>
+              <w:t>27</w:t>
             </w:r>
           </w:p>
         </w:tc>
@@ -2458,7 +2458,7 @@
                 <w:b w:val="0"/>
                 <w:sz w:val="22"/>
               </w:rPr>
-              <w:t>3</w:t>
+              <w:t>27</w:t>
             </w:r>
           </w:p>
         </w:tc>
@@ -2494,7 +2494,7 @@
                 <w:b/>
                 <w:sz w:val="22"/>
               </w:rPr>
-              <w:t>3</w:t>
+              <w:t>28</w:t>
             </w:r>
           </w:p>
         </w:tc>
@@ -2531,7 +2531,7 @@
                 <w:b w:val="0"/>
                 <w:sz w:val="22"/>
               </w:rPr>
-              <w:t>3</w:t>
+              <w:t>28</w:t>
             </w:r>
           </w:p>
         </w:tc>
@@ -2568,7 +2568,7 @@
                 <w:b w:val="0"/>
                 <w:sz w:val="22"/>
               </w:rPr>
-              <w:t>3</w:t>
+              <w:t>28</w:t>
             </w:r>
           </w:p>
         </w:tc>
@@ -2605,7 +2605,7 @@
                 <w:b w:val="0"/>
                 <w:sz w:val="22"/>
               </w:rPr>
-              <w:t>3</w:t>
+              <w:t>29</w:t>
             </w:r>
           </w:p>
         </w:tc>
@@ -2642,7 +2642,7 @@
                 <w:b w:val="0"/>
                 <w:sz w:val="22"/>
               </w:rPr>
-              <w:t>3</w:t>
+              <w:t>29</w:t>
             </w:r>
           </w:p>
         </w:tc>
@@ -2679,7 +2679,7 @@
                 <w:b w:val="0"/>
                 <w:sz w:val="22"/>
               </w:rPr>
-              <w:t>3</w:t>
+              <w:t>30</w:t>
             </w:r>
           </w:p>
         </w:tc>
@@ -2715,7 +2715,7 @@
                 <w:b/>
                 <w:sz w:val="22"/>
               </w:rPr>
-              <w:t>3</w:t>
+              <w:t>31</w:t>
             </w:r>
           </w:p>
         </w:tc>
@@ -8895,7 +8895,7 @@
           </w:tcPr>
           <w:p>
             <w:pPr>
-              <w:jc w:val="left"/>
+              <w:jc w:val="center"/>
             </w:pPr>
             <w:r>
               <w:rPr>
@@ -9002,7 +9002,7 @@
           </w:tcPr>
           <w:p>
             <w:pPr>
-              <w:jc w:val="left"/>
+              <w:jc w:val="center"/>
             </w:pPr>
             <w:r>
               <w:rPr>
@@ -9109,7 +9109,7 @@
           </w:tcPr>
           <w:p>
             <w:pPr>
-              <w:jc w:val="left"/>
+              <w:jc w:val="center"/>
             </w:pPr>
             <w:r>
               <w:rPr>
@@ -9216,7 +9216,7 @@
           </w:tcPr>
           <w:p>
             <w:pPr>
-              <w:jc w:val="left"/>
+              <w:jc w:val="center"/>
             </w:pPr>
             <w:r>
               <w:rPr>
@@ -9323,7 +9323,7 @@
           </w:tcPr>
           <w:p>
             <w:pPr>
-              <w:jc w:val="left"/>
+              <w:jc w:val="center"/>
             </w:pPr>
             <w:r>
               <w:rPr>
@@ -9430,7 +9430,7 @@
           </w:tcPr>
           <w:p>
             <w:pPr>
-              <w:jc w:val="left"/>
+              <w:jc w:val="center"/>
             </w:pPr>
             <w:r>
               <w:rPr>

</xml_diff>

<commit_message>
revert(phase07): restore original Duy DOCX report file from main
</commit_message>
<xml_diff>
--- a/draft/fraud-detection/reports/[Nhom9]_BaoCao_FraudDetection_Sprint3_Duy.docx
+++ b/draft/fraud-detection/reports/[Nhom9]_BaoCao_FraudDetection_Sprint3_Duy.docx
@@ -8895,7 +8895,7 @@
           </w:tcPr>
           <w:p>
             <w:pPr>
-              <w:jc w:val="center"/>
+              <w:jc w:val="left"/>
             </w:pPr>
             <w:r>
               <w:rPr>
@@ -9002,7 +9002,7 @@
           </w:tcPr>
           <w:p>
             <w:pPr>
-              <w:jc w:val="center"/>
+              <w:jc w:val="left"/>
             </w:pPr>
             <w:r>
               <w:rPr>
@@ -9109,7 +9109,7 @@
           </w:tcPr>
           <w:p>
             <w:pPr>
-              <w:jc w:val="center"/>
+              <w:jc w:val="left"/>
             </w:pPr>
             <w:r>
               <w:rPr>
@@ -9216,7 +9216,7 @@
           </w:tcPr>
           <w:p>
             <w:pPr>
-              <w:jc w:val="center"/>
+              <w:jc w:val="left"/>
             </w:pPr>
             <w:r>
               <w:rPr>
@@ -9323,7 +9323,7 @@
           </w:tcPr>
           <w:p>
             <w:pPr>
-              <w:jc w:val="center"/>
+              <w:jc w:val="left"/>
             </w:pPr>
             <w:r>
               <w:rPr>
@@ -9430,7 +9430,7 @@
           </w:tcPr>
           <w:p>
             <w:pPr>
-              <w:jc w:val="center"/>
+              <w:jc w:val="left"/>
             </w:pPr>
             <w:r>
               <w:rPr>
@@ -9728,9 +9728,9 @@
       </w:tblPr>
       <w:tblGrid>
         <w:gridCol w:w="700"/>
-        <w:gridCol w:w="3522"/>
-        <w:gridCol w:w="924"/>
-        <w:gridCol w:w="3926"/>
+        <w:gridCol w:w="4364"/>
+        <w:gridCol w:w="1145"/>
+        <w:gridCol w:w="2862"/>
       </w:tblGrid>
       <w:tr>
         <w:trPr>
@@ -9756,7 +9756,7 @@
         </w:tc>
         <w:tc>
           <w:tcPr>
-            <w:tcW w:type="dxa" w:w="3522"/>
+            <w:tcW w:type="dxa" w:w="4364"/>
           </w:tcPr>
           <w:p>
             <w:pPr>
@@ -9773,7 +9773,7 @@
         </w:tc>
         <w:tc>
           <w:tcPr>
-            <w:tcW w:type="dxa" w:w="924"/>
+            <w:tcW w:type="dxa" w:w="1145"/>
           </w:tcPr>
           <w:p>
             <w:pPr>
@@ -9790,7 +9790,7 @@
         </w:tc>
         <w:tc>
           <w:tcPr>
-            <w:tcW w:type="dxa" w:w="3926"/>
+            <w:tcW w:type="dxa" w:w="2862"/>
           </w:tcPr>
           <w:p>
             <w:pPr>
@@ -9829,7 +9829,7 @@
         </w:tc>
         <w:tc>
           <w:tcPr>
-            <w:tcW w:type="dxa" w:w="3522"/>
+            <w:tcW w:type="dxa" w:w="4364"/>
           </w:tcPr>
           <w:p>
             <w:pPr>
@@ -9846,7 +9846,7 @@
         </w:tc>
         <w:tc>
           <w:tcPr>
-            <w:tcW w:type="dxa" w:w="924"/>
+            <w:tcW w:type="dxa" w:w="1145"/>
           </w:tcPr>
           <w:p>
             <w:pPr>
@@ -9863,7 +9863,7 @@
         </w:tc>
         <w:tc>
           <w:tcPr>
-            <w:tcW w:type="dxa" w:w="3926"/>
+            <w:tcW w:type="dxa" w:w="2862"/>
           </w:tcPr>
           <w:p>
             <w:pPr>
@@ -9902,7 +9902,7 @@
         </w:tc>
         <w:tc>
           <w:tcPr>
-            <w:tcW w:type="dxa" w:w="3522"/>
+            <w:tcW w:type="dxa" w:w="4364"/>
           </w:tcPr>
           <w:p>
             <w:pPr>
@@ -9919,7 +9919,7 @@
         </w:tc>
         <w:tc>
           <w:tcPr>
-            <w:tcW w:type="dxa" w:w="924"/>
+            <w:tcW w:type="dxa" w:w="1145"/>
           </w:tcPr>
           <w:p>
             <w:pPr>
@@ -9936,7 +9936,7 @@
         </w:tc>
         <w:tc>
           <w:tcPr>
-            <w:tcW w:type="dxa" w:w="3926"/>
+            <w:tcW w:type="dxa" w:w="2862"/>
           </w:tcPr>
           <w:p>
             <w:pPr>
@@ -9975,7 +9975,7 @@
         </w:tc>
         <w:tc>
           <w:tcPr>
-            <w:tcW w:type="dxa" w:w="3522"/>
+            <w:tcW w:type="dxa" w:w="4364"/>
           </w:tcPr>
           <w:p>
             <w:pPr>
@@ -9992,7 +9992,7 @@
         </w:tc>
         <w:tc>
           <w:tcPr>
-            <w:tcW w:type="dxa" w:w="924"/>
+            <w:tcW w:type="dxa" w:w="1145"/>
           </w:tcPr>
           <w:p>
             <w:pPr>
@@ -10009,7 +10009,7 @@
         </w:tc>
         <w:tc>
           <w:tcPr>
-            <w:tcW w:type="dxa" w:w="3926"/>
+            <w:tcW w:type="dxa" w:w="2862"/>
           </w:tcPr>
           <w:p>
             <w:pPr>
@@ -10048,7 +10048,7 @@
         </w:tc>
         <w:tc>
           <w:tcPr>
-            <w:tcW w:type="dxa" w:w="3522"/>
+            <w:tcW w:type="dxa" w:w="4364"/>
           </w:tcPr>
           <w:p>
             <w:pPr>
@@ -10065,7 +10065,7 @@
         </w:tc>
         <w:tc>
           <w:tcPr>
-            <w:tcW w:type="dxa" w:w="924"/>
+            <w:tcW w:type="dxa" w:w="1145"/>
           </w:tcPr>
           <w:p>
             <w:pPr>
@@ -10082,7 +10082,7 @@
         </w:tc>
         <w:tc>
           <w:tcPr>
-            <w:tcW w:type="dxa" w:w="3926"/>
+            <w:tcW w:type="dxa" w:w="2862"/>
           </w:tcPr>
           <w:p>
             <w:pPr>
@@ -10121,7 +10121,7 @@
         </w:tc>
         <w:tc>
           <w:tcPr>
-            <w:tcW w:type="dxa" w:w="3522"/>
+            <w:tcW w:type="dxa" w:w="4364"/>
           </w:tcPr>
           <w:p>
             <w:pPr>
@@ -10138,7 +10138,7 @@
         </w:tc>
         <w:tc>
           <w:tcPr>
-            <w:tcW w:type="dxa" w:w="924"/>
+            <w:tcW w:type="dxa" w:w="1145"/>
           </w:tcPr>
           <w:p>
             <w:pPr>
@@ -10155,7 +10155,7 @@
         </w:tc>
         <w:tc>
           <w:tcPr>
-            <w:tcW w:type="dxa" w:w="3926"/>
+            <w:tcW w:type="dxa" w:w="2862"/>
           </w:tcPr>
           <w:p>
             <w:pPr>
@@ -10194,7 +10194,7 @@
         </w:tc>
         <w:tc>
           <w:tcPr>
-            <w:tcW w:type="dxa" w:w="3522"/>
+            <w:tcW w:type="dxa" w:w="4364"/>
           </w:tcPr>
           <w:p>
             <w:pPr>
@@ -10211,7 +10211,7 @@
         </w:tc>
         <w:tc>
           <w:tcPr>
-            <w:tcW w:type="dxa" w:w="924"/>
+            <w:tcW w:type="dxa" w:w="1145"/>
           </w:tcPr>
           <w:p>
             <w:pPr>
@@ -10228,7 +10228,7 @@
         </w:tc>
         <w:tc>
           <w:tcPr>
-            <w:tcW w:type="dxa" w:w="3926"/>
+            <w:tcW w:type="dxa" w:w="2862"/>
           </w:tcPr>
           <w:p>
             <w:pPr>
@@ -10267,7 +10267,7 @@
         </w:tc>
         <w:tc>
           <w:tcPr>
-            <w:tcW w:type="dxa" w:w="3522"/>
+            <w:tcW w:type="dxa" w:w="4364"/>
           </w:tcPr>
           <w:p>
             <w:pPr>
@@ -10284,7 +10284,7 @@
         </w:tc>
         <w:tc>
           <w:tcPr>
-            <w:tcW w:type="dxa" w:w="924"/>
+            <w:tcW w:type="dxa" w:w="1145"/>
           </w:tcPr>
           <w:p>
             <w:pPr>
@@ -10295,13 +10295,13 @@
                 <w:b w:val="0"/>
                 <w:sz w:val="19"/>
               </w:rPr>
-              <w:t>Hoàn thành</w:t>
-            </w:r>
-          </w:p>
-        </w:tc>
-        <w:tc>
-          <w:tcPr>
-            <w:tcW w:type="dxa" w:w="3926"/>
+              <w:t>Một phần</w:t>
+            </w:r>
+          </w:p>
+        </w:tc>
+        <w:tc>
+          <w:tcPr>
+            <w:tcW w:type="dxa" w:w="2862"/>
           </w:tcPr>
           <w:p>
             <w:pPr>
@@ -10312,7 +10312,7 @@
                 <w:b w:val="0"/>
                 <w:sz w:val="19"/>
               </w:rPr>
-              <w:t>Giao diện Streamlit đã tích hợp mô hình XGBoost-SMOTE và scaler thật</w:t>
+              <w:t>Giao diện đã dựng, chưa nạp mô hình thật</w:t>
             </w:r>
           </w:p>
         </w:tc>
@@ -10336,7 +10336,7 @@
         <w:rPr>
           <w:b w:val="0"/>
         </w:rPr>
-        <w:t>Toàn bộ bảy mục tiêu cụ thể đã hoàn thành. Trong đó mục tiêu thứ bảy đã tích hợp mô hình XGBoost-SMOTE cùng bộ tiền xử lý và scaler thật vào giao diện tương tác Streamlit, hỗ trợ 4 kịch bản thử nghiệm và vượt qua kiểm thử Browser QA.</w:t>
+        <w:t>Sáu mục tiêu đã hoàn thành. Mục tiêu thứ bảy mới đạt phần giao diện, phần kết nối mô hình vào ứng dụng minh họa còn đang thực hiện.</w:t>
       </w:r>
     </w:p>
     <w:p>

</xml_diff>

<commit_message>
feat(report): export standard submission docx and pdf from report builder
</commit_message>
<xml_diff>
--- a/draft/fraud-detection/reports/[Nhom9]_BaoCao_FraudDetection_Sprint3_Duy.docx
+++ b/draft/fraud-detection/reports/[Nhom9]_BaoCao_FraudDetection_Sprint3_Duy.docx
@@ -7826,7 +7826,7 @@
       <w:r>
         <w:drawing>
           <wp:inline xmlns:a="http://schemas.openxmlformats.org/drawingml/2006/main" xmlns:pic="http://schemas.openxmlformats.org/drawingml/2006/picture">
-            <wp:extent cx="5461000" cy="3624855"/>
+            <wp:extent cx="5461000" cy="3610073"/>
             <wp:docPr id="1" name="Picture 1"/>
             <wp:cNvGraphicFramePr>
               <a:graphicFrameLocks noChangeAspect="1"/>
@@ -7847,7 +7847,7 @@
                   <pic:spPr>
                     <a:xfrm>
                       <a:off x="0" y="0"/>
-                      <a:ext cx="5461000" cy="3624855"/>
+                      <a:ext cx="5461000" cy="3610073"/>
                     </a:xfrm>
                     <a:prstGeom prst="rect"/>
                   </pic:spPr>
@@ -8547,7 +8547,7 @@
       <w:r>
         <w:drawing>
           <wp:inline xmlns:a="http://schemas.openxmlformats.org/drawingml/2006/main" xmlns:pic="http://schemas.openxmlformats.org/drawingml/2006/picture">
-            <wp:extent cx="5461000" cy="3727625"/>
+            <wp:extent cx="5461000" cy="3728425"/>
             <wp:docPr id="2" name="Picture 2"/>
             <wp:cNvGraphicFramePr>
               <a:graphicFrameLocks noChangeAspect="1"/>
@@ -8568,7 +8568,7 @@
                   <pic:spPr>
                     <a:xfrm>
                       <a:off x="0" y="0"/>
-                      <a:ext cx="5461000" cy="3727625"/>
+                      <a:ext cx="5461000" cy="3728425"/>
                     </a:xfrm>
                     <a:prstGeom prst="rect"/>
                   </pic:spPr>
@@ -8895,7 +8895,7 @@
           </w:tcPr>
           <w:p>
             <w:pPr>
-              <w:jc w:val="left"/>
+              <w:jc w:val="center"/>
             </w:pPr>
             <w:r>
               <w:rPr>
@@ -9002,7 +9002,7 @@
           </w:tcPr>
           <w:p>
             <w:pPr>
-              <w:jc w:val="left"/>
+              <w:jc w:val="center"/>
             </w:pPr>
             <w:r>
               <w:rPr>
@@ -9109,7 +9109,7 @@
           </w:tcPr>
           <w:p>
             <w:pPr>
-              <w:jc w:val="left"/>
+              <w:jc w:val="center"/>
             </w:pPr>
             <w:r>
               <w:rPr>
@@ -9216,7 +9216,7 @@
           </w:tcPr>
           <w:p>
             <w:pPr>
-              <w:jc w:val="left"/>
+              <w:jc w:val="center"/>
             </w:pPr>
             <w:r>
               <w:rPr>
@@ -9323,7 +9323,7 @@
           </w:tcPr>
           <w:p>
             <w:pPr>
-              <w:jc w:val="left"/>
+              <w:jc w:val="center"/>
             </w:pPr>
             <w:r>
               <w:rPr>
@@ -9430,7 +9430,7 @@
           </w:tcPr>
           <w:p>
             <w:pPr>
-              <w:jc w:val="left"/>
+              <w:jc w:val="center"/>
             </w:pPr>
             <w:r>
               <w:rPr>
@@ -9728,9 +9728,9 @@
       </w:tblPr>
       <w:tblGrid>
         <w:gridCol w:w="700"/>
-        <w:gridCol w:w="4364"/>
-        <w:gridCol w:w="1145"/>
-        <w:gridCol w:w="2862"/>
+        <w:gridCol w:w="3522"/>
+        <w:gridCol w:w="924"/>
+        <w:gridCol w:w="3926"/>
       </w:tblGrid>
       <w:tr>
         <w:trPr>
@@ -9756,7 +9756,7 @@
         </w:tc>
         <w:tc>
           <w:tcPr>
-            <w:tcW w:type="dxa" w:w="4364"/>
+            <w:tcW w:type="dxa" w:w="3522"/>
           </w:tcPr>
           <w:p>
             <w:pPr>
@@ -9773,7 +9773,7 @@
         </w:tc>
         <w:tc>
           <w:tcPr>
-            <w:tcW w:type="dxa" w:w="1145"/>
+            <w:tcW w:type="dxa" w:w="924"/>
           </w:tcPr>
           <w:p>
             <w:pPr>
@@ -9790,7 +9790,7 @@
         </w:tc>
         <w:tc>
           <w:tcPr>
-            <w:tcW w:type="dxa" w:w="2862"/>
+            <w:tcW w:type="dxa" w:w="3926"/>
           </w:tcPr>
           <w:p>
             <w:pPr>
@@ -9829,7 +9829,7 @@
         </w:tc>
         <w:tc>
           <w:tcPr>
-            <w:tcW w:type="dxa" w:w="4364"/>
+            <w:tcW w:type="dxa" w:w="3522"/>
           </w:tcPr>
           <w:p>
             <w:pPr>
@@ -9846,7 +9846,7 @@
         </w:tc>
         <w:tc>
           <w:tcPr>
-            <w:tcW w:type="dxa" w:w="1145"/>
+            <w:tcW w:type="dxa" w:w="924"/>
           </w:tcPr>
           <w:p>
             <w:pPr>
@@ -9863,7 +9863,7 @@
         </w:tc>
         <w:tc>
           <w:tcPr>
-            <w:tcW w:type="dxa" w:w="2862"/>
+            <w:tcW w:type="dxa" w:w="3926"/>
           </w:tcPr>
           <w:p>
             <w:pPr>
@@ -9902,7 +9902,7 @@
         </w:tc>
         <w:tc>
           <w:tcPr>
-            <w:tcW w:type="dxa" w:w="4364"/>
+            <w:tcW w:type="dxa" w:w="3522"/>
           </w:tcPr>
           <w:p>
             <w:pPr>
@@ -9919,7 +9919,7 @@
         </w:tc>
         <w:tc>
           <w:tcPr>
-            <w:tcW w:type="dxa" w:w="1145"/>
+            <w:tcW w:type="dxa" w:w="924"/>
           </w:tcPr>
           <w:p>
             <w:pPr>
@@ -9936,7 +9936,7 @@
         </w:tc>
         <w:tc>
           <w:tcPr>
-            <w:tcW w:type="dxa" w:w="2862"/>
+            <w:tcW w:type="dxa" w:w="3926"/>
           </w:tcPr>
           <w:p>
             <w:pPr>
@@ -9975,7 +9975,7 @@
         </w:tc>
         <w:tc>
           <w:tcPr>
-            <w:tcW w:type="dxa" w:w="4364"/>
+            <w:tcW w:type="dxa" w:w="3522"/>
           </w:tcPr>
           <w:p>
             <w:pPr>
@@ -9992,7 +9992,7 @@
         </w:tc>
         <w:tc>
           <w:tcPr>
-            <w:tcW w:type="dxa" w:w="1145"/>
+            <w:tcW w:type="dxa" w:w="924"/>
           </w:tcPr>
           <w:p>
             <w:pPr>
@@ -10009,7 +10009,7 @@
         </w:tc>
         <w:tc>
           <w:tcPr>
-            <w:tcW w:type="dxa" w:w="2862"/>
+            <w:tcW w:type="dxa" w:w="3926"/>
           </w:tcPr>
           <w:p>
             <w:pPr>
@@ -10048,7 +10048,7 @@
         </w:tc>
         <w:tc>
           <w:tcPr>
-            <w:tcW w:type="dxa" w:w="4364"/>
+            <w:tcW w:type="dxa" w:w="3522"/>
           </w:tcPr>
           <w:p>
             <w:pPr>
@@ -10065,7 +10065,7 @@
         </w:tc>
         <w:tc>
           <w:tcPr>
-            <w:tcW w:type="dxa" w:w="1145"/>
+            <w:tcW w:type="dxa" w:w="924"/>
           </w:tcPr>
           <w:p>
             <w:pPr>
@@ -10082,7 +10082,7 @@
         </w:tc>
         <w:tc>
           <w:tcPr>
-            <w:tcW w:type="dxa" w:w="2862"/>
+            <w:tcW w:type="dxa" w:w="3926"/>
           </w:tcPr>
           <w:p>
             <w:pPr>
@@ -10121,7 +10121,7 @@
         </w:tc>
         <w:tc>
           <w:tcPr>
-            <w:tcW w:type="dxa" w:w="4364"/>
+            <w:tcW w:type="dxa" w:w="3522"/>
           </w:tcPr>
           <w:p>
             <w:pPr>
@@ -10138,7 +10138,7 @@
         </w:tc>
         <w:tc>
           <w:tcPr>
-            <w:tcW w:type="dxa" w:w="1145"/>
+            <w:tcW w:type="dxa" w:w="924"/>
           </w:tcPr>
           <w:p>
             <w:pPr>
@@ -10155,7 +10155,7 @@
         </w:tc>
         <w:tc>
           <w:tcPr>
-            <w:tcW w:type="dxa" w:w="2862"/>
+            <w:tcW w:type="dxa" w:w="3926"/>
           </w:tcPr>
           <w:p>
             <w:pPr>
@@ -10194,7 +10194,7 @@
         </w:tc>
         <w:tc>
           <w:tcPr>
-            <w:tcW w:type="dxa" w:w="4364"/>
+            <w:tcW w:type="dxa" w:w="3522"/>
           </w:tcPr>
           <w:p>
             <w:pPr>
@@ -10211,7 +10211,7 @@
         </w:tc>
         <w:tc>
           <w:tcPr>
-            <w:tcW w:type="dxa" w:w="1145"/>
+            <w:tcW w:type="dxa" w:w="924"/>
           </w:tcPr>
           <w:p>
             <w:pPr>
@@ -10228,7 +10228,7 @@
         </w:tc>
         <w:tc>
           <w:tcPr>
-            <w:tcW w:type="dxa" w:w="2862"/>
+            <w:tcW w:type="dxa" w:w="3926"/>
           </w:tcPr>
           <w:p>
             <w:pPr>
@@ -10267,7 +10267,7 @@
         </w:tc>
         <w:tc>
           <w:tcPr>
-            <w:tcW w:type="dxa" w:w="4364"/>
+            <w:tcW w:type="dxa" w:w="3522"/>
           </w:tcPr>
           <w:p>
             <w:pPr>
@@ -10284,7 +10284,7 @@
         </w:tc>
         <w:tc>
           <w:tcPr>
-            <w:tcW w:type="dxa" w:w="1145"/>
+            <w:tcW w:type="dxa" w:w="924"/>
           </w:tcPr>
           <w:p>
             <w:pPr>
@@ -10295,13 +10295,13 @@
                 <w:b w:val="0"/>
                 <w:sz w:val="19"/>
               </w:rPr>
-              <w:t>Một phần</w:t>
-            </w:r>
-          </w:p>
-        </w:tc>
-        <w:tc>
-          <w:tcPr>
-            <w:tcW w:type="dxa" w:w="2862"/>
+              <w:t>Hoàn thành</w:t>
+            </w:r>
+          </w:p>
+        </w:tc>
+        <w:tc>
+          <w:tcPr>
+            <w:tcW w:type="dxa" w:w="3926"/>
           </w:tcPr>
           <w:p>
             <w:pPr>
@@ -10312,7 +10312,7 @@
                 <w:b w:val="0"/>
                 <w:sz w:val="19"/>
               </w:rPr>
-              <w:t>Giao diện đã dựng, chưa nạp mô hình thật</w:t>
+              <w:t>Giao diện Streamlit đã tích hợp mô hình XGBoost-SMOTE và scaler thật</w:t>
             </w:r>
           </w:p>
         </w:tc>
@@ -10336,7 +10336,7 @@
         <w:rPr>
           <w:b w:val="0"/>
         </w:rPr>
-        <w:t>Sáu mục tiêu đã hoàn thành. Mục tiêu thứ bảy mới đạt phần giao diện, phần kết nối mô hình vào ứng dụng minh họa còn đang thực hiện.</w:t>
+        <w:t>Toàn bộ bảy mục tiêu cụ thể đã hoàn thành. Trong đó mục tiêu thứ bảy đã tích hợp mô hình XGBoost-SMOTE cùng bộ tiền xử lý và scaler thật vào giao diện tương tác Streamlit, hỗ trợ 4 kịch bản thử nghiệm và vượt qua kiểm thử Browser QA.</w:t>
       </w:r>
     </w:p>
     <w:p>

</xml_diff>